<commit_message>
add init helpers for easier usage
</commit_message>
<xml_diff>
--- a/src/cassy/additional_data/templates/template.docx
+++ b/src/cassy/additional_data/templates/template.docx
@@ -425,7 +425,6 @@
               <w:bottom w:val="single" w:sz="4" w:space="0" w:color="auto"/>
               <w:right w:val="nil"/>
             </w:tcBorders>
-            <w:shd w:val="clear" w:color="auto" w:fill="auto"/>
             <w:noWrap/>
             <w:vAlign w:val="center"/>
             <w:hideMark/>
@@ -461,7 +460,6 @@
               <w:bottom w:val="single" w:sz="4" w:space="0" w:color="auto"/>
               <w:right w:val="single" w:sz="8" w:space="0" w:color="000000"/>
             </w:tcBorders>
-            <w:shd w:val="clear" w:color="auto" w:fill="auto"/>
             <w:noWrap/>
             <w:vAlign w:val="bottom"/>
             <w:hideMark/>
@@ -503,7 +501,6 @@
               <w:bottom w:val="single" w:sz="4" w:space="0" w:color="auto"/>
               <w:right w:val="nil"/>
             </w:tcBorders>
-            <w:shd w:val="clear" w:color="auto" w:fill="auto"/>
             <w:noWrap/>
             <w:vAlign w:val="center"/>
             <w:hideMark/>
@@ -539,7 +536,6 @@
               <w:bottom w:val="single" w:sz="4" w:space="0" w:color="auto"/>
               <w:right w:val="single" w:sz="8" w:space="0" w:color="000000"/>
             </w:tcBorders>
-            <w:shd w:val="clear" w:color="auto" w:fill="auto"/>
             <w:noWrap/>
             <w:vAlign w:val="bottom"/>
             <w:hideMark/>
@@ -581,7 +577,6 @@
               <w:bottom w:val="single" w:sz="4" w:space="0" w:color="auto"/>
               <w:right w:val="nil"/>
             </w:tcBorders>
-            <w:shd w:val="clear" w:color="auto" w:fill="auto"/>
             <w:noWrap/>
             <w:vAlign w:val="center"/>
             <w:hideMark/>
@@ -617,7 +612,6 @@
               <w:bottom w:val="single" w:sz="4" w:space="0" w:color="auto"/>
               <w:right w:val="single" w:sz="8" w:space="0" w:color="000000"/>
             </w:tcBorders>
-            <w:shd w:val="clear" w:color="auto" w:fill="auto"/>
             <w:noWrap/>
             <w:vAlign w:val="bottom"/>
             <w:hideMark/>
@@ -659,7 +653,6 @@
               <w:bottom w:val="single" w:sz="8" w:space="0" w:color="auto"/>
               <w:right w:val="nil"/>
             </w:tcBorders>
-            <w:shd w:val="clear" w:color="auto" w:fill="auto"/>
             <w:noWrap/>
             <w:vAlign w:val="center"/>
             <w:hideMark/>
@@ -695,7 +688,6 @@
               <w:bottom w:val="single" w:sz="8" w:space="0" w:color="auto"/>
               <w:right w:val="single" w:sz="8" w:space="0" w:color="000000"/>
             </w:tcBorders>
-            <w:shd w:val="clear" w:color="auto" w:fill="auto"/>
             <w:noWrap/>
             <w:vAlign w:val="bottom"/>
             <w:hideMark/>
@@ -1271,7 +1263,6 @@
               <w:bottom w:val="single" w:sz="4" w:space="0" w:color="auto"/>
               <w:right w:val="nil"/>
             </w:tcBorders>
-            <w:shd w:val="clear" w:color="auto" w:fill="auto"/>
             <w:noWrap/>
             <w:vAlign w:val="center"/>
             <w:hideMark/>
@@ -1307,7 +1298,6 @@
               <w:bottom w:val="single" w:sz="4" w:space="0" w:color="auto"/>
               <w:right w:val="single" w:sz="8" w:space="0" w:color="000000"/>
             </w:tcBorders>
-            <w:shd w:val="clear" w:color="auto" w:fill="auto"/>
             <w:noWrap/>
             <w:vAlign w:val="center"/>
             <w:hideMark/>
@@ -1340,7 +1330,6 @@
               <w:bottom w:val="single" w:sz="4" w:space="0" w:color="auto"/>
               <w:right w:val="nil"/>
             </w:tcBorders>
-            <w:shd w:val="clear" w:color="auto" w:fill="auto"/>
             <w:noWrap/>
             <w:vAlign w:val="center"/>
             <w:hideMark/>
@@ -1376,7 +1365,6 @@
               <w:bottom w:val="single" w:sz="4" w:space="0" w:color="auto"/>
               <w:right w:val="single" w:sz="8" w:space="0" w:color="000000"/>
             </w:tcBorders>
-            <w:shd w:val="clear" w:color="auto" w:fill="auto"/>
             <w:noWrap/>
             <w:vAlign w:val="center"/>
             <w:hideMark/>
@@ -1409,7 +1397,6 @@
               <w:bottom w:val="single" w:sz="4" w:space="0" w:color="auto"/>
               <w:right w:val="nil"/>
             </w:tcBorders>
-            <w:shd w:val="clear" w:color="auto" w:fill="auto"/>
             <w:noWrap/>
             <w:vAlign w:val="center"/>
             <w:hideMark/>
@@ -1445,7 +1432,6 @@
               <w:bottom w:val="single" w:sz="4" w:space="0" w:color="auto"/>
               <w:right w:val="single" w:sz="8" w:space="0" w:color="000000"/>
             </w:tcBorders>
-            <w:shd w:val="clear" w:color="auto" w:fill="auto"/>
             <w:noWrap/>
             <w:vAlign w:val="center"/>
             <w:hideMark/>
@@ -1478,7 +1464,6 @@
               <w:bottom w:val="single" w:sz="8" w:space="0" w:color="auto"/>
               <w:right w:val="nil"/>
             </w:tcBorders>
-            <w:shd w:val="clear" w:color="auto" w:fill="auto"/>
             <w:noWrap/>
             <w:vAlign w:val="center"/>
             <w:hideMark/>
@@ -1514,7 +1499,6 @@
               <w:bottom w:val="single" w:sz="8" w:space="0" w:color="auto"/>
               <w:right w:val="single" w:sz="8" w:space="0" w:color="000000"/>
             </w:tcBorders>
-            <w:shd w:val="clear" w:color="auto" w:fill="auto"/>
             <w:noWrap/>
             <w:vAlign w:val="center"/>
             <w:hideMark/>
@@ -6054,256 +6038,16 @@
   <w:p>
     <w:pPr>
       <w:pStyle w:val="Footer"/>
-      <w:pBdr>
-        <w:top w:val="single" w:sz="4" w:space="1" w:color="auto"/>
-      </w:pBdr>
-      <w:jc w:val="right"/>
-      <w:rPr>
-        <w:color w:val="AC0437"/>
-        <w:sz w:val="20"/>
-        <w:highlight w:val="red"/>
-      </w:rPr>
-    </w:pPr>
-    <w:r>
-      <w:rPr>
-        <w:noProof/>
-        <w:highlight w:val="red"/>
-        <w:lang w:val="en-US" w:eastAsia="en-US"/>
-      </w:rPr>
-      <mc:AlternateContent>
-        <mc:Choice Requires="wps">
-          <w:drawing>
-            <wp:anchor distT="0" distB="0" distL="114300" distR="114300" simplePos="0" relativeHeight="251658240" behindDoc="0" locked="0" layoutInCell="1" allowOverlap="1" wp14:anchorId="58B26248" wp14:editId="4E715932">
-              <wp:simplePos x="0" y="0"/>
-              <wp:positionH relativeFrom="column">
-                <wp:posOffset>-3043</wp:posOffset>
-              </wp:positionH>
-              <wp:positionV relativeFrom="paragraph">
-                <wp:posOffset>242364</wp:posOffset>
-              </wp:positionV>
-              <wp:extent cx="485574" cy="422408"/>
-              <wp:effectExtent l="0" t="19050" r="0" b="130175"/>
-              <wp:wrapNone/>
-              <wp:docPr id="11" name="Luna 11"/>
-              <wp:cNvGraphicFramePr>
-                <a:graphicFrameLocks xmlns:a="http://schemas.openxmlformats.org/drawingml/2006/main"/>
-              </wp:cNvGraphicFramePr>
-              <a:graphic xmlns:a="http://schemas.openxmlformats.org/drawingml/2006/main">
-                <a:graphicData uri="http://schemas.microsoft.com/office/word/2010/wordprocessingShape">
-                  <wps:wsp>
-                    <wps:cNvSpPr>
-                      <a:spLocks noChangeArrowheads="1"/>
-                    </wps:cNvSpPr>
-                    <wps:spPr bwMode="auto">
-                      <a:xfrm>
-                        <a:off x="0" y="0"/>
-                        <a:ext cx="485574" cy="422408"/>
-                      </a:xfrm>
-                      <a:prstGeom prst="moon">
-                        <a:avLst>
-                          <a:gd name="adj" fmla="val 14037"/>
-                        </a:avLst>
-                      </a:prstGeom>
-                      <a:solidFill>
-                        <a:srgbClr val="CA0032"/>
-                      </a:solidFill>
-                      <a:ln w="9525">
-                        <a:noFill/>
-                        <a:miter lim="800000"/>
-                        <a:headEnd/>
-                        <a:tailEnd/>
-                      </a:ln>
-                      <a:effectLst>
-                        <a:outerShdw blurRad="50800" dist="38100" dir="2700000" algn="tl" rotWithShape="0">
-                          <a:prstClr val="black">
-                            <a:alpha val="40000"/>
-                          </a:prstClr>
-                        </a:outerShdw>
-                      </a:effectLst>
-                      <a:scene3d>
-                        <a:camera prst="isometricLeftDown"/>
-                        <a:lightRig rig="contrasting" dir="t">
-                          <a:rot lat="0" lon="0" rev="1500000"/>
-                        </a:lightRig>
-                      </a:scene3d>
-                      <a:sp3d prstMaterial="metal"/>
-                    </wps:spPr>
-                    <wps:bodyPr rot="0" vert="horz" wrap="square" lIns="91440" tIns="45720" rIns="91440" bIns="45720" anchor="t" anchorCtr="0" upright="1">
-                      <a:noAutofit/>
-                    </wps:bodyPr>
-                  </wps:wsp>
-                </a:graphicData>
-              </a:graphic>
-              <wp14:sizeRelH relativeFrom="page">
-                <wp14:pctWidth>0</wp14:pctWidth>
-              </wp14:sizeRelH>
-              <wp14:sizeRelV relativeFrom="page">
-                <wp14:pctHeight>0</wp14:pctHeight>
-              </wp14:sizeRelV>
-            </wp:anchor>
-          </w:drawing>
-        </mc:Choice>
-        <mc:Fallback xmlns:arto="http://schemas.microsoft.com/office/word/2006/arto">
-          <w:pict>
-            <v:shapetype w14:anchorId="42E25035" id="_x0000_t184" coordsize="21600,21600" o:spt="184" adj="10800" path="m21600,qx,10800,21600,21600wa@0@10@6@11,21600,21600,21600,xe">
-              <v:stroke joinstyle="miter"/>
-              <v:formulas>
-                <v:f eqn="val #0"/>
-                <v:f eqn="sum 21600 0 #0"/>
-                <v:f eqn="prod #0 #0 @1"/>
-                <v:f eqn="prod 21600 21600 @1"/>
-                <v:f eqn="prod @3 2 1"/>
-                <v:f eqn="sum @4 0 @2"/>
-                <v:f eqn="sum @5 0 #0"/>
-                <v:f eqn="prod @5 1 2"/>
-                <v:f eqn="sum @7 0 #0"/>
-                <v:f eqn="prod @8 1 2"/>
-                <v:f eqn="sum 10800 0 @9"/>
-                <v:f eqn="sum @9 10800 0"/>
-                <v:f eqn="prod #0 9598 32768"/>
-                <v:f eqn="sum 21600 0 @12"/>
-                <v:f eqn="ellipse @13 21600 10800"/>
-                <v:f eqn="sum 10800 0 @14"/>
-                <v:f eqn="sum @14 10800 0"/>
-              </v:formulas>
-              <v:path o:connecttype="custom" o:connectlocs="21600,0;0,10800;21600,21600;@0,10800" o:connectangles="270,180,90,0" textboxrect="@12,@15,@0,@16"/>
-              <v:handles>
-                <v:h position="#0,center" xrange="0,18900"/>
-              </v:handles>
-            </v:shapetype>
-            <v:shape id="Luna 11" o:spid="_x0000_s1026" type="#_x0000_t184" style="position:absolute;margin-left:-.25pt;margin-top:19.1pt;width:38.25pt;height:33.25pt;z-index:251669504;visibility:visible;mso-wrap-style:square;mso-width-percent:0;mso-height-percent:0;mso-wrap-distance-left:9pt;mso-wrap-distance-top:0;mso-wrap-distance-right:9pt;mso-wrap-distance-bottom:0;mso-position-horizontal:absolute;mso-position-horizontal-relative:text;mso-position-vertical:absolute;mso-position-vertical-relative:text;mso-width-percent:0;mso-height-percent:0;mso-width-relative:page;mso-height-relative:page;v-text-anchor:top" o:gfxdata="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" adj="3032" fillcolor="#ca0032" stroked="f">
-              <v:shadow on="t" color="black" opacity="26214f" origin="-.5,-.5" offset=".74836mm,.74836mm"/>
-              <o:extrusion v:ext="view" viewpoint="-100pt,-100pt" viewpointorigin="-.5" skewangle="0" skewamt="0"/>
-            </v:shape>
-          </w:pict>
-        </mc:Fallback>
-      </mc:AlternateContent>
-    </w:r>
-  </w:p>
-  <w:p>
-    <w:pPr>
-      <w:pStyle w:val="Footer"/>
       <w:tabs>
         <w:tab w:val="clear" w:pos="4819"/>
         <w:tab w:val="clear" w:pos="9638"/>
         <w:tab w:val="left" w:pos="2640"/>
       </w:tabs>
       <w:spacing w:before="0"/>
-      <w:ind w:left="142" w:firstLine="284"/>
+      <w:rPr>
+        <w:lang w:val="en-US"/>
+      </w:rPr>
     </w:pPr>
-    <w:proofErr w:type="spellStart"/>
-    <w:r>
-      <w:rPr>
-        <w:color w:val="AC0437"/>
-        <w:sz w:val="20"/>
-      </w:rPr>
-      <w:t>pag</w:t>
-    </w:r>
-    <w:proofErr w:type="spellEnd"/>
-    <w:r>
-      <w:rPr>
-        <w:color w:val="AC0437"/>
-        <w:sz w:val="20"/>
-      </w:rPr>
-      <w:t>.</w:t>
-    </w:r>
-    <w:r>
-      <w:rPr>
-        <w:color w:val="AC0437"/>
-        <w:sz w:val="20"/>
-      </w:rPr>
-      <w:t xml:space="preserve"> </w:t>
-    </w:r>
-    <w:r>
-      <w:rPr>
-        <w:rStyle w:val="PageNumber"/>
-        <w:color w:val="AC0437"/>
-        <w:sz w:val="36"/>
-      </w:rPr>
-      <w:fldChar w:fldCharType="begin"/>
-    </w:r>
-    <w:r>
-      <w:rPr>
-        <w:rStyle w:val="PageNumber"/>
-        <w:color w:val="AC0437"/>
-        <w:sz w:val="36"/>
-      </w:rPr>
-      <w:instrText xml:space="preserve"> PAGE </w:instrText>
-    </w:r>
-    <w:r>
-      <w:rPr>
-        <w:rStyle w:val="PageNumber"/>
-        <w:color w:val="AC0437"/>
-        <w:sz w:val="36"/>
-      </w:rPr>
-      <w:fldChar w:fldCharType="separate"/>
-    </w:r>
-    <w:r>
-      <w:rPr>
-        <w:rStyle w:val="PageNumber"/>
-        <w:noProof/>
-        <w:color w:val="AC0437"/>
-        <w:sz w:val="36"/>
-      </w:rPr>
-      <w:t>174</w:t>
-    </w:r>
-    <w:r>
-      <w:rPr>
-        <w:rStyle w:val="PageNumber"/>
-        <w:color w:val="AC0437"/>
-        <w:sz w:val="36"/>
-      </w:rPr>
-      <w:fldChar w:fldCharType="end"/>
-    </w:r>
-    <w:r>
-      <w:rPr>
-        <w:rStyle w:val="PageNumber"/>
-        <w:color w:val="AC0437"/>
-        <w:sz w:val="20"/>
-      </w:rPr>
-      <w:t xml:space="preserve">/ </w:t>
-    </w:r>
-    <w:r>
-      <w:rPr>
-        <w:rStyle w:val="PageNumber"/>
-        <w:color w:val="AC0437"/>
-        <w:sz w:val="20"/>
-      </w:rPr>
-      <w:fldChar w:fldCharType="begin"/>
-    </w:r>
-    <w:r>
-      <w:rPr>
-        <w:rStyle w:val="PageNumber"/>
-        <w:color w:val="AC0437"/>
-        <w:sz w:val="20"/>
-      </w:rPr>
-      <w:instrText xml:space="preserve"> NUMPAGES </w:instrText>
-    </w:r>
-    <w:r>
-      <w:rPr>
-        <w:rStyle w:val="PageNumber"/>
-        <w:color w:val="AC0437"/>
-        <w:sz w:val="20"/>
-      </w:rPr>
-      <w:fldChar w:fldCharType="separate"/>
-    </w:r>
-    <w:r>
-      <w:rPr>
-        <w:rStyle w:val="PageNumber"/>
-        <w:noProof/>
-        <w:color w:val="AC0437"/>
-        <w:sz w:val="20"/>
-      </w:rPr>
-      <w:t>174</w:t>
-    </w:r>
-    <w:r>
-      <w:rPr>
-        <w:rStyle w:val="PageNumber"/>
-        <w:color w:val="AC0437"/>
-        <w:sz w:val="20"/>
-      </w:rPr>
-      <w:fldChar w:fldCharType="end"/>
-    </w:r>
   </w:p>
 </w:ftr>
 </file>
@@ -17457,17 +17201,19 @@
 </file>
 
 <file path=customXml/item1.xml><?xml version="1.0" encoding="utf-8"?>
-<p:properties xmlns:p="http://schemas.microsoft.com/office/2006/metadata/properties" xmlns:xsi="http://www.w3.org/2001/XMLSchema-instance" xmlns:pc="http://schemas.microsoft.com/office/infopath/2007/PartnerControls">
-  <documentManagement>
-    <TaxCatchAll xmlns="f41f4605-e15c-4135-bd96-d3970596b173" xsi:nil="true"/>
-    <lcf76f155ced4ddcb4097134ff3c332f xmlns="71e126cb-1963-4e7b-b13a-15d2f64f78e9">
-      <Terms xmlns="http://schemas.microsoft.com/office/infopath/2007/PartnerControls"/>
-    </lcf76f155ced4ddcb4097134ff3c332f>
-  </documentManagement>
-</p:properties>
+<?mso-contentType ?>
+<FormTemplates xmlns="http://schemas.microsoft.com/sharepoint/v3/contenttype/forms">
+  <Display>DocumentLibraryForm</Display>
+  <Edit>DocumentLibraryForm</Edit>
+  <New>DocumentLibraryForm</New>
+</FormTemplates>
 </file>
 
 <file path=customXml/item2.xml><?xml version="1.0" encoding="utf-8"?>
+<b:Sources xmlns:b="http://schemas.openxmlformats.org/officeDocument/2006/bibliography" xmlns="http://schemas.openxmlformats.org/officeDocument/2006/bibliography" SelectedStyle="\APA.XSL" StyleName="APA"/>
+</file>
+
+<file path=customXml/item3.xml><?xml version="1.0" encoding="utf-8"?>
 <ct:contentTypeSchema xmlns:ct="http://schemas.microsoft.com/office/2006/metadata/contentType" xmlns:ma="http://schemas.microsoft.com/office/2006/metadata/properties/metaAttributes" ct:_="" ma:_="" ma:contentTypeName="Documento" ma:contentTypeID="0x010100EFE0C39B20CFE747B2EDBEF1A424A9C1" ma:contentTypeVersion="14" ma:contentTypeDescription="Creare un nuovo documento." ma:contentTypeScope="" ma:versionID="fc5d43efe255f0326fdf88779d9e8cc0">
   <xsd:schema xmlns:xsd="http://www.w3.org/2001/XMLSchema" xmlns:xs="http://www.w3.org/2001/XMLSchema" xmlns:p="http://schemas.microsoft.com/office/2006/metadata/properties" xmlns:ns2="71e126cb-1963-4e7b-b13a-15d2f64f78e9" xmlns:ns3="f41f4605-e15c-4135-bd96-d3970596b173" targetNamespace="http://schemas.microsoft.com/office/2006/metadata/properties" ma:root="true" ma:fieldsID="c67b044c92a952204dd5da40bf3ff3c1" ns2:_="" ns3:_="">
     <xsd:import namespace="71e126cb-1963-4e7b-b13a-15d2f64f78e9"/>
@@ -17696,31 +17442,34 @@
 </ct:contentTypeSchema>
 </file>
 
-<file path=customXml/item3.xml><?xml version="1.0" encoding="utf-8"?>
-<b:Sources xmlns:b="http://schemas.openxmlformats.org/officeDocument/2006/bibliography" xmlns="http://schemas.openxmlformats.org/officeDocument/2006/bibliography" SelectedStyle="\APA.XSL" StyleName="APA"/>
-</file>
-
 <file path=customXml/item4.xml><?xml version="1.0" encoding="utf-8"?>
-<?mso-contentType ?>
-<FormTemplates xmlns="http://schemas.microsoft.com/sharepoint/v3/contenttype/forms">
-  <Display>DocumentLibraryForm</Display>
-  <Edit>DocumentLibraryForm</Edit>
-  <New>DocumentLibraryForm</New>
-</FormTemplates>
+<p:properties xmlns:p="http://schemas.microsoft.com/office/2006/metadata/properties" xmlns:xsi="http://www.w3.org/2001/XMLSchema-instance" xmlns:pc="http://schemas.microsoft.com/office/infopath/2007/PartnerControls">
+  <documentManagement>
+    <TaxCatchAll xmlns="f41f4605-e15c-4135-bd96-d3970596b173" xsi:nil="true"/>
+    <lcf76f155ced4ddcb4097134ff3c332f xmlns="71e126cb-1963-4e7b-b13a-15d2f64f78e9">
+      <Terms xmlns="http://schemas.microsoft.com/office/infopath/2007/PartnerControls"/>
+    </lcf76f155ced4ddcb4097134ff3c332f>
+  </documentManagement>
+</p:properties>
 </file>
 
 <file path=customXml/itemProps1.xml><?xml version="1.0" encoding="utf-8"?>
-<ds:datastoreItem xmlns:ds="http://schemas.openxmlformats.org/officeDocument/2006/customXml" ds:itemID="{2D700B25-50B5-4C35-B44E-38E1CD0E6FC3}">
+<ds:datastoreItem xmlns:ds="http://schemas.openxmlformats.org/officeDocument/2006/customXml" ds:itemID="{CD5A2A0D-FEC0-4FEC-B133-DCCFAFED876F}">
   <ds:schemaRefs>
-    <ds:schemaRef ds:uri="http://schemas.microsoft.com/office/2006/metadata/properties"/>
-    <ds:schemaRef ds:uri="http://schemas.microsoft.com/office/infopath/2007/PartnerControls"/>
-    <ds:schemaRef ds:uri="f41f4605-e15c-4135-bd96-d3970596b173"/>
-    <ds:schemaRef ds:uri="71e126cb-1963-4e7b-b13a-15d2f64f78e9"/>
+    <ds:schemaRef ds:uri="http://schemas.microsoft.com/sharepoint/v3/contenttype/forms"/>
   </ds:schemaRefs>
 </ds:datastoreItem>
 </file>
 
 <file path=customXml/itemProps2.xml><?xml version="1.0" encoding="utf-8"?>
+<ds:datastoreItem xmlns:ds="http://schemas.openxmlformats.org/officeDocument/2006/customXml" ds:itemID="{31BE98BA-896D-4656-97F3-064F0DB17D00}">
+  <ds:schemaRefs>
+    <ds:schemaRef ds:uri="http://schemas.openxmlformats.org/officeDocument/2006/bibliography"/>
+  </ds:schemaRefs>
+</ds:datastoreItem>
+</file>
+
+<file path=customXml/itemProps3.xml><?xml version="1.0" encoding="utf-8"?>
 <ds:datastoreItem xmlns:ds="http://schemas.openxmlformats.org/officeDocument/2006/customXml" ds:itemID="{B9972A93-6823-47B2-BEAF-4E0183404EAD}">
   <ds:schemaRefs>
     <ds:schemaRef ds:uri="http://schemas.microsoft.com/office/2006/metadata/contentType"/>
@@ -17739,18 +17488,13 @@
 </ds:datastoreItem>
 </file>
 
-<file path=customXml/itemProps3.xml><?xml version="1.0" encoding="utf-8"?>
-<ds:datastoreItem xmlns:ds="http://schemas.openxmlformats.org/officeDocument/2006/customXml" ds:itemID="{31BE98BA-896D-4656-97F3-064F0DB17D00}">
+<file path=customXml/itemProps4.xml><?xml version="1.0" encoding="utf-8"?>
+<ds:datastoreItem xmlns:ds="http://schemas.openxmlformats.org/officeDocument/2006/customXml" ds:itemID="{2D700B25-50B5-4C35-B44E-38E1CD0E6FC3}">
   <ds:schemaRefs>
-    <ds:schemaRef ds:uri="http://schemas.openxmlformats.org/officeDocument/2006/bibliography"/>
-  </ds:schemaRefs>
-</ds:datastoreItem>
-</file>
-
-<file path=customXml/itemProps4.xml><?xml version="1.0" encoding="utf-8"?>
-<ds:datastoreItem xmlns:ds="http://schemas.openxmlformats.org/officeDocument/2006/customXml" ds:itemID="{CD5A2A0D-FEC0-4FEC-B133-DCCFAFED876F}">
-  <ds:schemaRefs>
-    <ds:schemaRef ds:uri="http://schemas.microsoft.com/sharepoint/v3/contenttype/forms"/>
+    <ds:schemaRef ds:uri="http://schemas.microsoft.com/office/2006/metadata/properties"/>
+    <ds:schemaRef ds:uri="http://schemas.microsoft.com/office/infopath/2007/PartnerControls"/>
+    <ds:schemaRef ds:uri="f41f4605-e15c-4135-bd96-d3970596b173"/>
+    <ds:schemaRef ds:uri="71e126cb-1963-4e7b-b13a-15d2f64f78e9"/>
   </ds:schemaRefs>
 </ds:datastoreItem>
 </file>
</xml_diff>

<commit_message>
Add EN bolts fatigue and Inconel fatigue in RCC-MRx
</commit_message>
<xml_diff>
--- a/src/cassy/additional_data/templates/template.docx
+++ b/src/cassy/additional_data/templates/template.docx
@@ -200,13 +200,8 @@
               <w:pStyle w:val="TableHead"/>
             </w:pPr>
             <w:r>
-              <w:t xml:space="preserve">Service </w:t>
+              <w:t>Service lvl</w:t>
             </w:r>
-            <w:proofErr w:type="spellStart"/>
-            <w:r>
-              <w:t>lvl</w:t>
-            </w:r>
-            <w:proofErr w:type="spellEnd"/>
           </w:p>
         </w:tc>
         <w:tc>
@@ -1585,19 +1580,8 @@
                 <w:bCs/>
                 <w:lang w:val="en-IE"/>
               </w:rPr>
-              <w:t xml:space="preserve">Stress </w:t>
+              <w:t>Stress breakdwon</w:t>
             </w:r>
-            <w:proofErr w:type="spellStart"/>
-            <w:r>
-              <w:rPr>
-                <w:rFonts w:cstheme="minorHAnsi"/>
-                <w:b/>
-                <w:bCs/>
-                <w:lang w:val="en-IE"/>
-              </w:rPr>
-              <w:t>breakdwon</w:t>
-            </w:r>
-            <w:proofErr w:type="spellEnd"/>
           </w:p>
         </w:tc>
         <w:tc>
@@ -4548,7 +4532,6 @@
                 <w:lang w:val="en-IE" w:eastAsia="en-IE"/>
               </w:rPr>
             </w:pPr>
-            <w:proofErr w:type="spellStart"/>
             <w:r>
               <w:rPr>
                 <w:rFonts w:cstheme="minorHAnsi"/>
@@ -4560,7 +4543,6 @@
               </w:rPr>
               <w:t>Vj</w:t>
             </w:r>
-            <w:proofErr w:type="spellEnd"/>
             <w:r>
               <w:rPr>
                 <w:rFonts w:cstheme="minorHAnsi"/>
@@ -5935,7 +5917,6 @@
                 <w:lang w:val="en-IE" w:eastAsia="en-IE"/>
               </w:rPr>
             </w:pPr>
-            <w:proofErr w:type="spellStart"/>
             <w:r>
               <w:rPr>
                 <w:rFonts w:cstheme="minorHAnsi"/>
@@ -5947,7 +5928,6 @@
               </w:rPr>
               <w:t>Vj</w:t>
             </w:r>
-            <w:proofErr w:type="spellEnd"/>
             <w:r>
               <w:rPr>
                 <w:rFonts w:cstheme="minorHAnsi"/>
@@ -5991,6 +5971,1373 @@
                 <w:lang w:val="en-IE" w:eastAsia="en-IE"/>
               </w:rPr>
               <w:t>n/N</w:t>
+            </w:r>
+          </w:p>
+        </w:tc>
+      </w:tr>
+    </w:tbl>
+    <w:p/>
+    <w:tbl>
+      <w:tblPr>
+        <w:tblStyle w:val="python"/>
+        <w:tblW w:w="14024" w:type="dxa"/>
+        <w:tblLayout w:type="fixed"/>
+        <w:tblLook w:val="04A0" w:firstRow="1" w:lastRow="0" w:firstColumn="1" w:lastColumn="0" w:noHBand="0" w:noVBand="1"/>
+      </w:tblPr>
+      <w:tblGrid>
+        <w:gridCol w:w="701"/>
+        <w:gridCol w:w="992"/>
+        <w:gridCol w:w="991"/>
+        <w:gridCol w:w="708"/>
+        <w:gridCol w:w="851"/>
+        <w:gridCol w:w="711"/>
+        <w:gridCol w:w="992"/>
+        <w:gridCol w:w="990"/>
+        <w:gridCol w:w="709"/>
+        <w:gridCol w:w="850"/>
+        <w:gridCol w:w="993"/>
+        <w:gridCol w:w="992"/>
+        <w:gridCol w:w="850"/>
+        <w:gridCol w:w="851"/>
+        <w:gridCol w:w="850"/>
+        <w:gridCol w:w="993"/>
+      </w:tblGrid>
+      <w:tr>
+        <w:trPr>
+          <w:trHeight w:val="300"/>
+          <w:tblHeader/>
+        </w:trPr>
+        <w:tc>
+          <w:tcPr>
+            <w:tcW w:w="14024" w:type="dxa"/>
+            <w:gridSpan w:val="16"/>
+            <w:tcBorders>
+              <w:top w:val="single" w:sz="8" w:space="0" w:color="auto"/>
+              <w:left w:val="single" w:sz="8" w:space="0" w:color="auto"/>
+              <w:bottom w:val="single" w:sz="8" w:space="0" w:color="auto"/>
+              <w:right w:val="single" w:sz="8" w:space="0" w:color="000000"/>
+            </w:tcBorders>
+            <w:shd w:val="clear" w:color="auto" w:fill="D9D9D9" w:themeFill="background1" w:themeFillShade="D9"/>
+          </w:tcPr>
+          <w:p>
+            <w:pPr>
+              <w:spacing w:before="0" w:line="240" w:lineRule="auto"/>
+              <w:jc w:val="center"/>
+              <w:rPr>
+                <w:rFonts w:cstheme="minorHAnsi"/>
+                <w:b/>
+                <w:bCs/>
+                <w:color w:val="000000"/>
+                <w:sz w:val="12"/>
+                <w:szCs w:val="12"/>
+                <w:lang w:val="en-IE" w:eastAsia="en-IE"/>
+              </w:rPr>
+            </w:pPr>
+            <w:r>
+              <w:rPr>
+                <w:rFonts w:cstheme="minorHAnsi"/>
+                <w:b/>
+                <w:bCs/>
+                <w:color w:val="000000"/>
+                <w:sz w:val="12"/>
+                <w:szCs w:val="12"/>
+                <w:lang w:val="en-IE" w:eastAsia="en-IE"/>
+              </w:rPr>
+              <w:t>STRUCTURAL ASSESSMENT GENERAL DATA</w:t>
+            </w:r>
+          </w:p>
+        </w:tc>
+      </w:tr>
+      <w:tr>
+        <w:trPr>
+          <w:trHeight w:val="238"/>
+          <w:tblHeader/>
+        </w:trPr>
+        <w:tc>
+          <w:tcPr>
+            <w:tcW w:w="1693" w:type="dxa"/>
+            <w:gridSpan w:val="2"/>
+            <w:tcBorders>
+              <w:top w:val="nil"/>
+              <w:left w:val="single" w:sz="8" w:space="0" w:color="auto"/>
+              <w:bottom w:val="single" w:sz="4" w:space="0" w:color="auto"/>
+              <w:right w:val="single" w:sz="4" w:space="0" w:color="auto"/>
+            </w:tcBorders>
+            <w:shd w:val="clear" w:color="000000" w:fill="FFFFFF"/>
+            <w:noWrap/>
+            <w:hideMark/>
+          </w:tcPr>
+          <w:p>
+            <w:pPr>
+              <w:spacing w:before="0" w:line="240" w:lineRule="auto"/>
+              <w:jc w:val="left"/>
+              <w:rPr>
+                <w:rFonts w:cstheme="minorHAnsi"/>
+                <w:b/>
+                <w:bCs/>
+                <w:color w:val="000000"/>
+                <w:sz w:val="12"/>
+                <w:szCs w:val="12"/>
+                <w:lang w:val="en-IE" w:eastAsia="en-IE"/>
+              </w:rPr>
+            </w:pPr>
+            <w:r>
+              <w:rPr>
+                <w:rFonts w:cstheme="minorHAnsi"/>
+                <w:b/>
+                <w:bCs/>
+                <w:color w:val="000000"/>
+                <w:sz w:val="12"/>
+                <w:szCs w:val="12"/>
+                <w:lang w:val="en-IE" w:eastAsia="en-IE"/>
+              </w:rPr>
+              <w:t>COMPONENT:</w:t>
+            </w:r>
+          </w:p>
+        </w:tc>
+        <w:tc>
+          <w:tcPr>
+            <w:tcW w:w="4253" w:type="dxa"/>
+            <w:gridSpan w:val="5"/>
+            <w:tcBorders>
+              <w:top w:val="nil"/>
+              <w:left w:val="nil"/>
+              <w:bottom w:val="single" w:sz="4" w:space="0" w:color="auto"/>
+              <w:right w:val="single" w:sz="4" w:space="0" w:color="auto"/>
+            </w:tcBorders>
+            <w:shd w:val="clear" w:color="000000" w:fill="FFFFFF"/>
+            <w:noWrap/>
+            <w:hideMark/>
+          </w:tcPr>
+          <w:p>
+            <w:pPr>
+              <w:pStyle w:val="Table"/>
+              <w:rPr>
+                <w:szCs w:val="12"/>
+              </w:rPr>
+            </w:pPr>
+          </w:p>
+        </w:tc>
+        <w:tc>
+          <w:tcPr>
+            <w:tcW w:w="1699" w:type="dxa"/>
+            <w:gridSpan w:val="2"/>
+            <w:tcBorders>
+              <w:top w:val="single" w:sz="8" w:space="0" w:color="auto"/>
+              <w:left w:val="single" w:sz="8" w:space="0" w:color="auto"/>
+              <w:bottom w:val="single" w:sz="4" w:space="0" w:color="auto"/>
+              <w:right w:val="single" w:sz="4" w:space="0" w:color="auto"/>
+            </w:tcBorders>
+            <w:shd w:val="clear" w:color="000000" w:fill="FFFFFF"/>
+            <w:noWrap/>
+            <w:hideMark/>
+          </w:tcPr>
+          <w:p>
+            <w:pPr>
+              <w:spacing w:before="0" w:line="240" w:lineRule="auto"/>
+              <w:jc w:val="left"/>
+              <w:rPr>
+                <w:rFonts w:cstheme="minorHAnsi"/>
+                <w:b/>
+                <w:bCs/>
+                <w:color w:val="000000"/>
+                <w:sz w:val="12"/>
+                <w:szCs w:val="12"/>
+                <w:lang w:val="en-IE" w:eastAsia="en-IE"/>
+              </w:rPr>
+            </w:pPr>
+            <w:r>
+              <w:rPr>
+                <w:rFonts w:cstheme="minorHAnsi"/>
+                <w:b/>
+                <w:bCs/>
+                <w:color w:val="000000"/>
+                <w:sz w:val="12"/>
+                <w:szCs w:val="12"/>
+                <w:lang w:val="en-IE" w:eastAsia="en-IE"/>
+              </w:rPr>
+              <w:t>ASSESSMENT:</w:t>
+            </w:r>
+          </w:p>
+        </w:tc>
+        <w:tc>
+          <w:tcPr>
+            <w:tcW w:w="6379" w:type="dxa"/>
+            <w:gridSpan w:val="7"/>
+            <w:tcBorders>
+              <w:top w:val="single" w:sz="8" w:space="0" w:color="auto"/>
+              <w:left w:val="nil"/>
+              <w:bottom w:val="single" w:sz="4" w:space="0" w:color="auto"/>
+              <w:right w:val="single" w:sz="8" w:space="0" w:color="000000"/>
+            </w:tcBorders>
+            <w:shd w:val="clear" w:color="000000" w:fill="FFFFFF"/>
+          </w:tcPr>
+          <w:p>
+            <w:pPr>
+              <w:pStyle w:val="Table"/>
+              <w:rPr>
+                <w:szCs w:val="12"/>
+              </w:rPr>
+            </w:pPr>
+          </w:p>
+        </w:tc>
+      </w:tr>
+      <w:tr>
+        <w:trPr>
+          <w:trHeight w:val="288"/>
+          <w:tblHeader/>
+        </w:trPr>
+        <w:tc>
+          <w:tcPr>
+            <w:tcW w:w="1693" w:type="dxa"/>
+            <w:gridSpan w:val="2"/>
+            <w:tcBorders>
+              <w:top w:val="single" w:sz="4" w:space="0" w:color="auto"/>
+              <w:left w:val="single" w:sz="8" w:space="0" w:color="auto"/>
+              <w:bottom w:val="single" w:sz="4" w:space="0" w:color="auto"/>
+              <w:right w:val="single" w:sz="4" w:space="0" w:color="auto"/>
+            </w:tcBorders>
+            <w:shd w:val="clear" w:color="000000" w:fill="FFFFFF"/>
+            <w:noWrap/>
+            <w:hideMark/>
+          </w:tcPr>
+          <w:p>
+            <w:pPr>
+              <w:spacing w:before="0" w:line="240" w:lineRule="auto"/>
+              <w:jc w:val="left"/>
+              <w:rPr>
+                <w:rFonts w:cstheme="minorHAnsi"/>
+                <w:b/>
+                <w:bCs/>
+                <w:color w:val="000000"/>
+                <w:sz w:val="12"/>
+                <w:szCs w:val="12"/>
+                <w:lang w:val="en-IE" w:eastAsia="en-IE"/>
+              </w:rPr>
+            </w:pPr>
+            <w:r>
+              <w:rPr>
+                <w:rFonts w:cstheme="minorHAnsi"/>
+                <w:b/>
+                <w:bCs/>
+                <w:color w:val="000000"/>
+                <w:sz w:val="12"/>
+                <w:szCs w:val="12"/>
+                <w:lang w:val="en-IE" w:eastAsia="en-IE"/>
+              </w:rPr>
+              <w:t>BOLTED JUNCTION:</w:t>
+            </w:r>
+          </w:p>
+        </w:tc>
+        <w:tc>
+          <w:tcPr>
+            <w:tcW w:w="4253" w:type="dxa"/>
+            <w:gridSpan w:val="5"/>
+            <w:tcBorders>
+              <w:top w:val="single" w:sz="4" w:space="0" w:color="auto"/>
+              <w:left w:val="nil"/>
+              <w:bottom w:val="single" w:sz="4" w:space="0" w:color="auto"/>
+              <w:right w:val="single" w:sz="4" w:space="0" w:color="auto"/>
+            </w:tcBorders>
+            <w:shd w:val="clear" w:color="000000" w:fill="FFFFFF"/>
+            <w:noWrap/>
+          </w:tcPr>
+          <w:p>
+            <w:pPr>
+              <w:pStyle w:val="Table"/>
+              <w:rPr>
+                <w:szCs w:val="12"/>
+              </w:rPr>
+            </w:pPr>
+          </w:p>
+        </w:tc>
+        <w:tc>
+          <w:tcPr>
+            <w:tcW w:w="1699" w:type="dxa"/>
+            <w:gridSpan w:val="2"/>
+            <w:tcBorders>
+              <w:top w:val="single" w:sz="4" w:space="0" w:color="auto"/>
+              <w:left w:val="single" w:sz="8" w:space="0" w:color="auto"/>
+              <w:bottom w:val="single" w:sz="4" w:space="0" w:color="auto"/>
+              <w:right w:val="single" w:sz="4" w:space="0" w:color="auto"/>
+            </w:tcBorders>
+            <w:shd w:val="clear" w:color="000000" w:fill="FFFFFF"/>
+            <w:noWrap/>
+            <w:hideMark/>
+          </w:tcPr>
+          <w:p>
+            <w:pPr>
+              <w:spacing w:before="0" w:line="240" w:lineRule="auto"/>
+              <w:jc w:val="left"/>
+              <w:rPr>
+                <w:rFonts w:cstheme="minorHAnsi"/>
+                <w:b/>
+                <w:bCs/>
+                <w:color w:val="000000"/>
+                <w:sz w:val="12"/>
+                <w:szCs w:val="12"/>
+                <w:lang w:val="en-IE" w:eastAsia="en-IE"/>
+              </w:rPr>
+            </w:pPr>
+            <w:r>
+              <w:rPr>
+                <w:rFonts w:cstheme="minorHAnsi"/>
+                <w:b/>
+                <w:bCs/>
+                <w:color w:val="000000"/>
+                <w:sz w:val="12"/>
+                <w:szCs w:val="12"/>
+                <w:lang w:val="en-IE" w:eastAsia="en-IE"/>
+              </w:rPr>
+              <w:t>CODE:</w:t>
+            </w:r>
+          </w:p>
+        </w:tc>
+        <w:tc>
+          <w:tcPr>
+            <w:tcW w:w="6379" w:type="dxa"/>
+            <w:gridSpan w:val="7"/>
+            <w:tcBorders>
+              <w:top w:val="single" w:sz="4" w:space="0" w:color="auto"/>
+              <w:left w:val="nil"/>
+              <w:bottom w:val="single" w:sz="4" w:space="0" w:color="auto"/>
+              <w:right w:val="single" w:sz="8" w:space="0" w:color="000000"/>
+            </w:tcBorders>
+            <w:shd w:val="clear" w:color="000000" w:fill="FFFFFF"/>
+          </w:tcPr>
+          <w:p>
+            <w:pPr>
+              <w:pStyle w:val="Table"/>
+              <w:rPr>
+                <w:szCs w:val="12"/>
+              </w:rPr>
+            </w:pPr>
+          </w:p>
+        </w:tc>
+      </w:tr>
+      <w:tr>
+        <w:trPr>
+          <w:trHeight w:val="288"/>
+          <w:tblHeader/>
+        </w:trPr>
+        <w:tc>
+          <w:tcPr>
+            <w:tcW w:w="1693" w:type="dxa"/>
+            <w:gridSpan w:val="2"/>
+            <w:tcBorders>
+              <w:top w:val="single" w:sz="4" w:space="0" w:color="auto"/>
+              <w:left w:val="single" w:sz="8" w:space="0" w:color="auto"/>
+              <w:bottom w:val="single" w:sz="4" w:space="0" w:color="auto"/>
+              <w:right w:val="single" w:sz="4" w:space="0" w:color="auto"/>
+            </w:tcBorders>
+            <w:shd w:val="clear" w:color="000000" w:fill="FFFFFF"/>
+            <w:noWrap/>
+            <w:hideMark/>
+          </w:tcPr>
+          <w:p>
+            <w:pPr>
+              <w:spacing w:before="0" w:line="240" w:lineRule="auto"/>
+              <w:jc w:val="left"/>
+              <w:rPr>
+                <w:rFonts w:cstheme="minorHAnsi"/>
+                <w:b/>
+                <w:bCs/>
+                <w:color w:val="000000"/>
+                <w:sz w:val="12"/>
+                <w:szCs w:val="12"/>
+                <w:lang w:val="en-IE" w:eastAsia="en-IE"/>
+              </w:rPr>
+            </w:pPr>
+            <w:r>
+              <w:rPr>
+                <w:rFonts w:cstheme="minorHAnsi"/>
+                <w:b/>
+                <w:bCs/>
+                <w:color w:val="000000"/>
+                <w:sz w:val="12"/>
+                <w:szCs w:val="12"/>
+                <w:lang w:val="en-IE" w:eastAsia="en-IE"/>
+              </w:rPr>
+              <w:t>BOLT ID:</w:t>
+            </w:r>
+          </w:p>
+        </w:tc>
+        <w:tc>
+          <w:tcPr>
+            <w:tcW w:w="4253" w:type="dxa"/>
+            <w:gridSpan w:val="5"/>
+            <w:tcBorders>
+              <w:top w:val="single" w:sz="4" w:space="0" w:color="auto"/>
+              <w:left w:val="nil"/>
+              <w:bottom w:val="single" w:sz="4" w:space="0" w:color="auto"/>
+              <w:right w:val="single" w:sz="4" w:space="0" w:color="auto"/>
+            </w:tcBorders>
+            <w:shd w:val="clear" w:color="000000" w:fill="FFFFFF"/>
+            <w:noWrap/>
+          </w:tcPr>
+          <w:p>
+            <w:pPr>
+              <w:pStyle w:val="Table"/>
+              <w:rPr>
+                <w:szCs w:val="12"/>
+              </w:rPr>
+            </w:pPr>
+          </w:p>
+        </w:tc>
+        <w:tc>
+          <w:tcPr>
+            <w:tcW w:w="1699" w:type="dxa"/>
+            <w:gridSpan w:val="2"/>
+            <w:tcBorders>
+              <w:top w:val="single" w:sz="4" w:space="0" w:color="auto"/>
+              <w:left w:val="single" w:sz="8" w:space="0" w:color="auto"/>
+              <w:bottom w:val="single" w:sz="4" w:space="0" w:color="auto"/>
+              <w:right w:val="single" w:sz="4" w:space="0" w:color="auto"/>
+            </w:tcBorders>
+            <w:shd w:val="clear" w:color="000000" w:fill="FFFFFF"/>
+            <w:noWrap/>
+            <w:hideMark/>
+          </w:tcPr>
+          <w:p>
+            <w:pPr>
+              <w:spacing w:before="0" w:line="240" w:lineRule="auto"/>
+              <w:jc w:val="left"/>
+              <w:rPr>
+                <w:rFonts w:cstheme="minorHAnsi"/>
+                <w:b/>
+                <w:bCs/>
+                <w:color w:val="000000"/>
+                <w:sz w:val="12"/>
+                <w:szCs w:val="12"/>
+                <w:lang w:val="en-IE" w:eastAsia="en-IE"/>
+              </w:rPr>
+            </w:pPr>
+            <w:r>
+              <w:rPr>
+                <w:rFonts w:cstheme="minorHAnsi"/>
+                <w:b/>
+                <w:bCs/>
+                <w:color w:val="000000"/>
+                <w:sz w:val="12"/>
+                <w:szCs w:val="12"/>
+                <w:lang w:val="en-IE" w:eastAsia="en-IE"/>
+              </w:rPr>
+              <w:t>PARAGRAPH:</w:t>
+            </w:r>
+          </w:p>
+        </w:tc>
+        <w:tc>
+          <w:tcPr>
+            <w:tcW w:w="6379" w:type="dxa"/>
+            <w:gridSpan w:val="7"/>
+            <w:tcBorders>
+              <w:top w:val="single" w:sz="4" w:space="0" w:color="auto"/>
+              <w:left w:val="nil"/>
+              <w:bottom w:val="single" w:sz="4" w:space="0" w:color="auto"/>
+              <w:right w:val="single" w:sz="8" w:space="0" w:color="000000"/>
+            </w:tcBorders>
+            <w:shd w:val="clear" w:color="000000" w:fill="FFFFFF"/>
+          </w:tcPr>
+          <w:p>
+            <w:pPr>
+              <w:pStyle w:val="Table"/>
+              <w:rPr>
+                <w:szCs w:val="12"/>
+              </w:rPr>
+            </w:pPr>
+          </w:p>
+        </w:tc>
+      </w:tr>
+      <w:tr>
+        <w:trPr>
+          <w:trHeight w:val="246"/>
+          <w:tblHeader/>
+        </w:trPr>
+        <w:tc>
+          <w:tcPr>
+            <w:tcW w:w="1693" w:type="dxa"/>
+            <w:gridSpan w:val="2"/>
+            <w:tcBorders>
+              <w:top w:val="single" w:sz="4" w:space="0" w:color="auto"/>
+              <w:left w:val="single" w:sz="8" w:space="0" w:color="auto"/>
+              <w:bottom w:val="single" w:sz="4" w:space="0" w:color="auto"/>
+              <w:right w:val="single" w:sz="4" w:space="0" w:color="auto"/>
+            </w:tcBorders>
+            <w:shd w:val="clear" w:color="000000" w:fill="FFFFFF"/>
+            <w:noWrap/>
+            <w:hideMark/>
+          </w:tcPr>
+          <w:p>
+            <w:pPr>
+              <w:spacing w:before="0" w:line="240" w:lineRule="auto"/>
+              <w:jc w:val="left"/>
+              <w:rPr>
+                <w:rFonts w:cstheme="minorHAnsi"/>
+                <w:b/>
+                <w:bCs/>
+                <w:color w:val="000000"/>
+                <w:sz w:val="12"/>
+                <w:szCs w:val="12"/>
+                <w:lang w:val="en-IE" w:eastAsia="en-IE"/>
+              </w:rPr>
+            </w:pPr>
+            <w:r>
+              <w:rPr>
+                <w:rFonts w:cstheme="minorHAnsi"/>
+                <w:b/>
+                <w:bCs/>
+                <w:color w:val="000000"/>
+                <w:sz w:val="12"/>
+                <w:szCs w:val="12"/>
+                <w:lang w:val="en-IE" w:eastAsia="en-IE"/>
+              </w:rPr>
+              <w:t>MATERIAL:</w:t>
+            </w:r>
+          </w:p>
+        </w:tc>
+        <w:tc>
+          <w:tcPr>
+            <w:tcW w:w="4253" w:type="dxa"/>
+            <w:gridSpan w:val="5"/>
+            <w:tcBorders>
+              <w:top w:val="single" w:sz="4" w:space="0" w:color="auto"/>
+              <w:left w:val="nil"/>
+              <w:bottom w:val="single" w:sz="4" w:space="0" w:color="auto"/>
+              <w:right w:val="single" w:sz="4" w:space="0" w:color="auto"/>
+            </w:tcBorders>
+            <w:shd w:val="clear" w:color="000000" w:fill="FFFFFF"/>
+            <w:noWrap/>
+          </w:tcPr>
+          <w:p>
+            <w:pPr>
+              <w:pStyle w:val="Table"/>
+              <w:rPr>
+                <w:szCs w:val="12"/>
+              </w:rPr>
+            </w:pPr>
+          </w:p>
+        </w:tc>
+        <w:tc>
+          <w:tcPr>
+            <w:tcW w:w="8078" w:type="dxa"/>
+            <w:gridSpan w:val="9"/>
+            <w:tcBorders>
+              <w:top w:val="single" w:sz="4" w:space="0" w:color="auto"/>
+              <w:left w:val="single" w:sz="8" w:space="0" w:color="auto"/>
+              <w:bottom w:val="single" w:sz="4" w:space="0" w:color="auto"/>
+              <w:right w:val="single" w:sz="8" w:space="0" w:color="000000"/>
+            </w:tcBorders>
+            <w:shd w:val="clear" w:color="000000" w:fill="FFFFFF"/>
+          </w:tcPr>
+          <w:p>
+            <w:pPr>
+              <w:spacing w:before="0" w:line="240" w:lineRule="auto"/>
+              <w:jc w:val="center"/>
+              <w:rPr>
+                <w:rFonts w:cstheme="minorHAnsi"/>
+                <w:b/>
+                <w:bCs/>
+                <w:color w:val="000000"/>
+                <w:sz w:val="12"/>
+                <w:szCs w:val="12"/>
+                <w:lang w:val="en-IE" w:eastAsia="en-IE"/>
+              </w:rPr>
+            </w:pPr>
+            <w:r>
+              <w:rPr>
+                <w:rFonts w:cstheme="minorHAnsi"/>
+                <w:b/>
+                <w:bCs/>
+                <w:color w:val="000000"/>
+                <w:sz w:val="12"/>
+                <w:szCs w:val="12"/>
+                <w:lang w:val="en-IE" w:eastAsia="en-IE"/>
+              </w:rPr>
+              <w:t> </w:t>
+            </w:r>
+          </w:p>
+        </w:tc>
+      </w:tr>
+      <w:tr>
+        <w:trPr>
+          <w:trHeight w:val="106"/>
+          <w:tblHeader/>
+        </w:trPr>
+        <w:tc>
+          <w:tcPr>
+            <w:tcW w:w="701" w:type="dxa"/>
+            <w:tcBorders>
+              <w:top w:val="single" w:sz="8" w:space="0" w:color="auto"/>
+              <w:left w:val="single" w:sz="8" w:space="0" w:color="auto"/>
+              <w:bottom w:val="single" w:sz="8" w:space="0" w:color="auto"/>
+              <w:right w:val="single" w:sz="4" w:space="0" w:color="auto"/>
+            </w:tcBorders>
+            <w:shd w:val="clear" w:color="auto" w:fill="D9D9D9" w:themeFill="background1" w:themeFillShade="D9"/>
+            <w:hideMark/>
+          </w:tcPr>
+          <w:p>
+            <w:pPr>
+              <w:spacing w:before="0" w:line="240" w:lineRule="auto"/>
+              <w:jc w:val="center"/>
+              <w:rPr>
+                <w:rFonts w:cstheme="minorHAnsi"/>
+                <w:b/>
+                <w:bCs/>
+                <w:color w:val="000000"/>
+                <w:sz w:val="12"/>
+                <w:szCs w:val="12"/>
+                <w:lang w:val="en-IE" w:eastAsia="en-IE"/>
+              </w:rPr>
+            </w:pPr>
+            <w:r>
+              <w:rPr>
+                <w:rFonts w:cstheme="minorHAnsi"/>
+                <w:b/>
+                <w:bCs/>
+                <w:color w:val="000000"/>
+                <w:sz w:val="12"/>
+                <w:szCs w:val="12"/>
+                <w:lang w:val="en-IE" w:eastAsia="en-IE"/>
+              </w:rPr>
+              <w:t>ID</w:t>
+            </w:r>
+          </w:p>
+        </w:tc>
+        <w:tc>
+          <w:tcPr>
+            <w:tcW w:w="992" w:type="dxa"/>
+            <w:tcBorders>
+              <w:top w:val="single" w:sz="8" w:space="0" w:color="auto"/>
+              <w:left w:val="single" w:sz="4" w:space="0" w:color="auto"/>
+              <w:bottom w:val="single" w:sz="8" w:space="0" w:color="auto"/>
+              <w:right w:val="single" w:sz="4" w:space="0" w:color="auto"/>
+            </w:tcBorders>
+            <w:shd w:val="clear" w:color="auto" w:fill="D9D9D9" w:themeFill="background1" w:themeFillShade="D9"/>
+            <w:hideMark/>
+          </w:tcPr>
+          <w:p>
+            <w:pPr>
+              <w:spacing w:before="0" w:line="240" w:lineRule="auto"/>
+              <w:jc w:val="center"/>
+              <w:rPr>
+                <w:rFonts w:cstheme="minorHAnsi"/>
+                <w:b/>
+                <w:bCs/>
+                <w:sz w:val="12"/>
+                <w:szCs w:val="12"/>
+                <w:lang w:val="en-IE" w:eastAsia="en-IE"/>
+              </w:rPr>
+            </w:pPr>
+            <w:r>
+              <w:rPr>
+                <w:rFonts w:cstheme="minorHAnsi"/>
+                <w:b/>
+                <w:bCs/>
+                <w:sz w:val="12"/>
+                <w:szCs w:val="12"/>
+                <w:lang w:val="en-IE" w:eastAsia="en-IE"/>
+              </w:rPr>
+              <w:t>Operating Conditions</w:t>
+            </w:r>
+          </w:p>
+        </w:tc>
+        <w:tc>
+          <w:tcPr>
+            <w:tcW w:w="991" w:type="dxa"/>
+            <w:tcBorders>
+              <w:top w:val="single" w:sz="8" w:space="0" w:color="auto"/>
+              <w:left w:val="single" w:sz="4" w:space="0" w:color="auto"/>
+              <w:bottom w:val="single" w:sz="8" w:space="0" w:color="auto"/>
+              <w:right w:val="single" w:sz="4" w:space="0" w:color="auto"/>
+            </w:tcBorders>
+            <w:shd w:val="clear" w:color="auto" w:fill="D9D9D9" w:themeFill="background1" w:themeFillShade="D9"/>
+            <w:hideMark/>
+          </w:tcPr>
+          <w:p>
+            <w:pPr>
+              <w:spacing w:before="0" w:line="240" w:lineRule="auto"/>
+              <w:jc w:val="center"/>
+              <w:rPr>
+                <w:rFonts w:cstheme="minorHAnsi"/>
+                <w:b/>
+                <w:bCs/>
+                <w:sz w:val="12"/>
+                <w:szCs w:val="12"/>
+                <w:lang w:val="en-IE" w:eastAsia="en-IE"/>
+              </w:rPr>
+            </w:pPr>
+            <w:r>
+              <w:rPr>
+                <w:rFonts w:cstheme="minorHAnsi"/>
+                <w:b/>
+                <w:bCs/>
+                <w:sz w:val="12"/>
+                <w:szCs w:val="12"/>
+                <w:lang w:val="en-IE" w:eastAsia="en-IE"/>
+              </w:rPr>
+              <w:t>Stress Range</w:t>
+            </w:r>
+          </w:p>
+        </w:tc>
+        <w:tc>
+          <w:tcPr>
+            <w:tcW w:w="708" w:type="dxa"/>
+            <w:tcBorders>
+              <w:top w:val="single" w:sz="8" w:space="0" w:color="auto"/>
+              <w:left w:val="single" w:sz="4" w:space="0" w:color="auto"/>
+              <w:bottom w:val="single" w:sz="8" w:space="0" w:color="auto"/>
+              <w:right w:val="single" w:sz="4" w:space="0" w:color="auto"/>
+            </w:tcBorders>
+            <w:shd w:val="clear" w:color="auto" w:fill="D9D9D9" w:themeFill="background1" w:themeFillShade="D9"/>
+            <w:hideMark/>
+          </w:tcPr>
+          <w:p>
+            <w:pPr>
+              <w:spacing w:before="0" w:line="240" w:lineRule="auto"/>
+              <w:jc w:val="center"/>
+              <w:rPr>
+                <w:rFonts w:cstheme="minorHAnsi"/>
+                <w:b/>
+                <w:bCs/>
+                <w:sz w:val="12"/>
+                <w:szCs w:val="12"/>
+                <w:lang w:val="en-IE" w:eastAsia="en-IE"/>
+              </w:rPr>
+            </w:pPr>
+            <w:r>
+              <w:rPr>
+                <w:rFonts w:cstheme="minorHAnsi"/>
+                <w:b/>
+                <w:bCs/>
+                <w:sz w:val="12"/>
+                <w:szCs w:val="12"/>
+                <w:lang w:val="en-IE" w:eastAsia="en-IE"/>
+              </w:rPr>
+              <w:t>Loading Category</w:t>
+            </w:r>
+          </w:p>
+        </w:tc>
+        <w:tc>
+          <w:tcPr>
+            <w:tcW w:w="851" w:type="dxa"/>
+            <w:tcBorders>
+              <w:top w:val="single" w:sz="8" w:space="0" w:color="auto"/>
+              <w:left w:val="single" w:sz="4" w:space="0" w:color="auto"/>
+              <w:bottom w:val="single" w:sz="8" w:space="0" w:color="auto"/>
+              <w:right w:val="single" w:sz="4" w:space="0" w:color="auto"/>
+            </w:tcBorders>
+            <w:shd w:val="clear" w:color="auto" w:fill="D9D9D9" w:themeFill="background1" w:themeFillShade="D9"/>
+          </w:tcPr>
+          <w:p>
+            <w:pPr>
+              <w:spacing w:before="0" w:line="240" w:lineRule="auto"/>
+              <w:jc w:val="center"/>
+              <w:rPr>
+                <w:rFonts w:cstheme="minorHAnsi"/>
+                <w:b/>
+                <w:bCs/>
+                <w:sz w:val="12"/>
+                <w:szCs w:val="12"/>
+                <w:lang w:val="en-IE" w:eastAsia="en-IE"/>
+              </w:rPr>
+            </w:pPr>
+            <w:r>
+              <w:rPr>
+                <w:rFonts w:cstheme="minorHAnsi"/>
+                <w:b/>
+                <w:bCs/>
+                <w:sz w:val="12"/>
+                <w:szCs w:val="12"/>
+                <w:lang w:val="en-IE" w:eastAsia="en-IE"/>
+              </w:rPr>
+              <w:t>Service Level</w:t>
+            </w:r>
+          </w:p>
+        </w:tc>
+        <w:tc>
+          <w:tcPr>
+            <w:tcW w:w="711" w:type="dxa"/>
+            <w:tcBorders>
+              <w:top w:val="single" w:sz="8" w:space="0" w:color="auto"/>
+              <w:left w:val="single" w:sz="4" w:space="0" w:color="auto"/>
+              <w:bottom w:val="single" w:sz="8" w:space="0" w:color="auto"/>
+              <w:right w:val="single" w:sz="4" w:space="0" w:color="auto"/>
+            </w:tcBorders>
+            <w:shd w:val="clear" w:color="auto" w:fill="D9D9D9" w:themeFill="background1" w:themeFillShade="D9"/>
+          </w:tcPr>
+          <w:p>
+            <w:pPr>
+              <w:spacing w:before="0" w:line="240" w:lineRule="auto"/>
+              <w:jc w:val="center"/>
+              <w:rPr>
+                <w:rFonts w:cstheme="minorHAnsi"/>
+                <w:b/>
+                <w:bCs/>
+                <w:sz w:val="12"/>
+                <w:szCs w:val="12"/>
+                <w:lang w:val="en-IE" w:eastAsia="en-IE"/>
+              </w:rPr>
+            </w:pPr>
+            <w:r>
+              <w:rPr>
+                <w:rFonts w:cstheme="minorHAnsi"/>
+                <w:b/>
+                <w:bCs/>
+                <w:sz w:val="12"/>
+                <w:szCs w:val="12"/>
+                <w:lang w:val="en-IE" w:eastAsia="en-IE"/>
+              </w:rPr>
+              <w:t>T [°C]</w:t>
+            </w:r>
+          </w:p>
+        </w:tc>
+        <w:tc>
+          <w:tcPr>
+            <w:tcW w:w="992" w:type="dxa"/>
+            <w:tcBorders>
+              <w:top w:val="single" w:sz="8" w:space="0" w:color="auto"/>
+              <w:left w:val="single" w:sz="4" w:space="0" w:color="auto"/>
+              <w:bottom w:val="single" w:sz="8" w:space="0" w:color="auto"/>
+              <w:right w:val="single" w:sz="4" w:space="0" w:color="auto"/>
+            </w:tcBorders>
+            <w:shd w:val="clear" w:color="auto" w:fill="D9D9D9" w:themeFill="background1" w:themeFillShade="D9"/>
+          </w:tcPr>
+          <w:p>
+            <w:pPr>
+              <w:spacing w:before="0" w:line="240" w:lineRule="auto"/>
+              <w:jc w:val="center"/>
+              <w:rPr>
+                <w:rFonts w:cstheme="minorHAnsi"/>
+                <w:b/>
+                <w:bCs/>
+                <w:sz w:val="12"/>
+                <w:szCs w:val="12"/>
+                <w:lang w:val="en-IE" w:eastAsia="en-IE"/>
+              </w:rPr>
+            </w:pPr>
+            <w:r>
+              <w:rPr>
+                <w:rFonts w:cstheme="minorHAnsi"/>
+                <w:b/>
+                <w:bCs/>
+                <w:sz w:val="12"/>
+                <w:szCs w:val="12"/>
+                <w:lang w:val="en-IE" w:eastAsia="en-IE"/>
+              </w:rPr>
+              <w:t>dpa</w:t>
+            </w:r>
+          </w:p>
+        </w:tc>
+        <w:tc>
+          <w:tcPr>
+            <w:tcW w:w="990" w:type="dxa"/>
+            <w:tcBorders>
+              <w:top w:val="single" w:sz="8" w:space="0" w:color="auto"/>
+              <w:left w:val="single" w:sz="4" w:space="0" w:color="auto"/>
+              <w:bottom w:val="single" w:sz="8" w:space="0" w:color="auto"/>
+              <w:right w:val="single" w:sz="4" w:space="0" w:color="auto"/>
+            </w:tcBorders>
+            <w:shd w:val="clear" w:color="auto" w:fill="D9D9D9" w:themeFill="background1" w:themeFillShade="D9"/>
+          </w:tcPr>
+          <w:p>
+            <w:pPr>
+              <w:spacing w:before="0" w:line="240" w:lineRule="auto"/>
+              <w:jc w:val="center"/>
+              <w:rPr>
+                <w:rFonts w:ascii="Symbol" w:hAnsi="Symbol" w:cstheme="minorHAnsi"/>
+                <w:b/>
+                <w:bCs/>
+                <w:sz w:val="12"/>
+                <w:szCs w:val="12"/>
+                <w:lang w:val="en-IE" w:eastAsia="en-IE"/>
+              </w:rPr>
+            </w:pPr>
+            <m:oMathPara>
+              <m:oMath>
+                <m:sSub>
+                  <m:sSubPr>
+                    <m:ctrlPr>
+                      <w:rPr>
+                        <w:rFonts w:ascii="Cambria Math" w:hAnsi="Cambria Math" w:cstheme="minorHAnsi"/>
+                        <w:b/>
+                        <w:bCs/>
+                        <w:i/>
+                        <w:sz w:val="12"/>
+                        <w:szCs w:val="12"/>
+                        <w:lang w:val="en-IE" w:eastAsia="en-IE"/>
+                      </w:rPr>
+                    </m:ctrlPr>
+                  </m:sSubPr>
+                  <m:e>
+                    <m:r>
+                      <m:rPr>
+                        <m:sty m:val="bi"/>
+                      </m:rPr>
+                      <w:rPr>
+                        <w:rFonts w:ascii="Cambria Math" w:hAnsi="Cambria Math" w:cstheme="minorHAnsi"/>
+                        <w:sz w:val="12"/>
+                        <w:szCs w:val="12"/>
+                        <w:lang w:val="en-IE" w:eastAsia="en-IE"/>
+                      </w:rPr>
+                      <m:t>∆σ</m:t>
+                    </m:r>
+                  </m:e>
+                  <m:sub>
+                    <m:r>
+                      <m:rPr>
+                        <m:sty m:val="bi"/>
+                      </m:rPr>
+                      <w:rPr>
+                        <w:rFonts w:ascii="Cambria Math" w:hAnsi="Cambria Math" w:cstheme="minorHAnsi"/>
+                        <w:sz w:val="12"/>
+                        <w:szCs w:val="12"/>
+                        <w:lang w:val="en-IE" w:eastAsia="en-IE"/>
+                      </w:rPr>
+                      <m:t>N</m:t>
+                    </m:r>
+                  </m:sub>
+                </m:sSub>
+              </m:oMath>
+            </m:oMathPara>
+          </w:p>
+        </w:tc>
+        <w:tc>
+          <w:tcPr>
+            <w:tcW w:w="709" w:type="dxa"/>
+            <w:tcBorders>
+              <w:top w:val="single" w:sz="8" w:space="0" w:color="auto"/>
+              <w:left w:val="single" w:sz="4" w:space="0" w:color="auto"/>
+              <w:bottom w:val="single" w:sz="8" w:space="0" w:color="auto"/>
+              <w:right w:val="single" w:sz="4" w:space="0" w:color="auto"/>
+            </w:tcBorders>
+            <w:shd w:val="clear" w:color="auto" w:fill="D9D9D9" w:themeFill="background1" w:themeFillShade="D9"/>
+          </w:tcPr>
+          <w:p>
+            <w:pPr>
+              <w:spacing w:before="0" w:line="240" w:lineRule="auto"/>
+              <w:jc w:val="center"/>
+              <w:rPr>
+                <w:rFonts w:cstheme="minorHAnsi"/>
+                <w:b/>
+                <w:bCs/>
+                <w:sz w:val="12"/>
+                <w:szCs w:val="12"/>
+                <w:lang w:val="en-IE" w:eastAsia="en-IE"/>
+              </w:rPr>
+            </w:pPr>
+            <m:oMathPara>
+              <m:oMath>
+                <m:sSub>
+                  <m:sSubPr>
+                    <m:ctrlPr>
+                      <w:rPr>
+                        <w:rFonts w:ascii="Cambria Math" w:hAnsi="Cambria Math" w:cstheme="minorHAnsi"/>
+                        <w:b/>
+                        <w:bCs/>
+                        <w:i/>
+                        <w:sz w:val="12"/>
+                        <w:szCs w:val="12"/>
+                        <w:lang w:val="en-IE" w:eastAsia="en-IE"/>
+                      </w:rPr>
+                    </m:ctrlPr>
+                  </m:sSubPr>
+                  <m:e>
+                    <m:r>
+                      <m:rPr>
+                        <m:sty m:val="bi"/>
+                      </m:rPr>
+                      <w:rPr>
+                        <w:rFonts w:ascii="Cambria Math" w:hAnsi="Cambria Math" w:cstheme="minorHAnsi"/>
+                        <w:sz w:val="12"/>
+                        <w:szCs w:val="12"/>
+                        <w:lang w:val="en-IE" w:eastAsia="en-IE"/>
+                      </w:rPr>
+                      <m:t>R</m:t>
+                    </m:r>
+                  </m:e>
+                  <m:sub>
+                    <m:r>
+                      <m:rPr>
+                        <m:sty m:val="bi"/>
+                      </m:rPr>
+                      <w:rPr>
+                        <w:rFonts w:ascii="Cambria Math" w:hAnsi="Cambria Math" w:cstheme="minorHAnsi"/>
+                        <w:sz w:val="12"/>
+                        <w:szCs w:val="12"/>
+                        <w:lang w:val="en-IE" w:eastAsia="en-IE"/>
+                      </w:rPr>
+                      <m:t>m</m:t>
+                    </m:r>
+                  </m:sub>
+                </m:sSub>
+              </m:oMath>
+            </m:oMathPara>
+          </w:p>
+        </w:tc>
+        <w:tc>
+          <w:tcPr>
+            <w:tcW w:w="850" w:type="dxa"/>
+            <w:tcBorders>
+              <w:top w:val="single" w:sz="8" w:space="0" w:color="auto"/>
+              <w:left w:val="single" w:sz="4" w:space="0" w:color="auto"/>
+              <w:bottom w:val="single" w:sz="8" w:space="0" w:color="auto"/>
+              <w:right w:val="single" w:sz="4" w:space="0" w:color="auto"/>
+            </w:tcBorders>
+            <w:shd w:val="clear" w:color="auto" w:fill="D9D9D9" w:themeFill="background1" w:themeFillShade="D9"/>
+          </w:tcPr>
+          <w:p>
+            <w:pPr>
+              <w:spacing w:before="0" w:line="240" w:lineRule="auto"/>
+              <w:jc w:val="center"/>
+              <w:rPr>
+                <w:rFonts w:cstheme="minorHAnsi"/>
+                <w:b/>
+                <w:bCs/>
+                <w:sz w:val="12"/>
+                <w:szCs w:val="12"/>
+                <w:lang w:val="en-IE" w:eastAsia="en-IE"/>
+              </w:rPr>
+            </w:pPr>
+            <m:oMathPara>
+              <m:oMath>
+                <m:sSub>
+                  <m:sSubPr>
+                    <m:ctrlPr>
+                      <w:rPr>
+                        <w:rFonts w:ascii="Cambria Math" w:hAnsi="Cambria Math" w:cstheme="minorHAnsi"/>
+                        <w:b/>
+                        <w:bCs/>
+                        <w:i/>
+                        <w:sz w:val="12"/>
+                        <w:szCs w:val="12"/>
+                        <w:lang w:val="en-IE" w:eastAsia="en-IE"/>
+                      </w:rPr>
+                    </m:ctrlPr>
+                  </m:sSubPr>
+                  <m:e>
+                    <m:r>
+                      <m:rPr>
+                        <m:sty m:val="bi"/>
+                      </m:rPr>
+                      <w:rPr>
+                        <w:rFonts w:ascii="Cambria Math" w:hAnsi="Cambria Math" w:cstheme="minorHAnsi"/>
+                        <w:sz w:val="12"/>
+                        <w:szCs w:val="12"/>
+                        <w:lang w:val="en-IE" w:eastAsia="en-IE"/>
+                      </w:rPr>
+                      <m:t>f</m:t>
+                    </m:r>
+                  </m:e>
+                  <m:sub>
+                    <m:r>
+                      <m:rPr>
+                        <m:sty m:val="bi"/>
+                      </m:rPr>
+                      <w:rPr>
+                        <w:rFonts w:ascii="Cambria Math" w:hAnsi="Cambria Math" w:cstheme="minorHAnsi"/>
+                        <w:sz w:val="12"/>
+                        <w:szCs w:val="12"/>
+                        <w:lang w:val="en-IE" w:eastAsia="en-IE"/>
+                      </w:rPr>
+                      <m:t>e</m:t>
+                    </m:r>
+                  </m:sub>
+                </m:sSub>
+              </m:oMath>
+            </m:oMathPara>
+          </w:p>
+        </w:tc>
+        <w:tc>
+          <w:tcPr>
+            <w:tcW w:w="993" w:type="dxa"/>
+            <w:tcBorders>
+              <w:top w:val="single" w:sz="8" w:space="0" w:color="auto"/>
+              <w:left w:val="single" w:sz="4" w:space="0" w:color="auto"/>
+              <w:bottom w:val="single" w:sz="8" w:space="0" w:color="auto"/>
+              <w:right w:val="single" w:sz="4" w:space="0" w:color="auto"/>
+            </w:tcBorders>
+            <w:shd w:val="clear" w:color="auto" w:fill="D9D9D9" w:themeFill="background1" w:themeFillShade="D9"/>
+          </w:tcPr>
+          <w:p>
+            <w:pPr>
+              <w:spacing w:before="0" w:line="240" w:lineRule="auto"/>
+              <w:jc w:val="center"/>
+              <w:rPr>
+                <w:rFonts w:cstheme="minorHAnsi"/>
+                <w:b/>
+                <w:bCs/>
+                <w:sz w:val="12"/>
+                <w:szCs w:val="12"/>
+                <w:lang w:val="en-IE" w:eastAsia="en-IE"/>
+              </w:rPr>
+            </w:pPr>
+            <m:oMathPara>
+              <m:oMath>
+                <m:sSub>
+                  <m:sSubPr>
+                    <m:ctrlPr>
+                      <w:rPr>
+                        <w:rFonts w:ascii="Cambria Math" w:hAnsi="Cambria Math" w:cstheme="minorHAnsi"/>
+                        <w:b/>
+                        <w:bCs/>
+                        <w:i/>
+                        <w:sz w:val="12"/>
+                        <w:szCs w:val="12"/>
+                        <w:lang w:val="en-IE" w:eastAsia="en-IE"/>
+                      </w:rPr>
+                    </m:ctrlPr>
+                  </m:sSubPr>
+                  <m:e>
+                    <m:r>
+                      <m:rPr>
+                        <m:sty m:val="bi"/>
+                      </m:rPr>
+                      <w:rPr>
+                        <w:rFonts w:ascii="Cambria Math" w:hAnsi="Cambria Math" w:cstheme="minorHAnsi"/>
+                        <w:sz w:val="12"/>
+                        <w:szCs w:val="12"/>
+                        <w:lang w:val="en-IE" w:eastAsia="en-IE"/>
+                      </w:rPr>
+                      <m:t>f</m:t>
+                    </m:r>
+                  </m:e>
+                  <m:sub>
+                    <m:r>
+                      <m:rPr>
+                        <m:sty m:val="bi"/>
+                      </m:rPr>
+                      <w:rPr>
+                        <w:rFonts w:ascii="Cambria Math" w:hAnsi="Cambria Math" w:cstheme="minorHAnsi"/>
+                        <w:sz w:val="12"/>
+                        <w:szCs w:val="12"/>
+                        <w:lang w:val="en-IE" w:eastAsia="en-IE"/>
+                      </w:rPr>
+                      <m:t>t*</m:t>
+                    </m:r>
+                  </m:sub>
+                </m:sSub>
+              </m:oMath>
+            </m:oMathPara>
+          </w:p>
+        </w:tc>
+        <w:tc>
+          <w:tcPr>
+            <w:tcW w:w="992" w:type="dxa"/>
+            <w:tcBorders>
+              <w:top w:val="single" w:sz="8" w:space="0" w:color="auto"/>
+              <w:left w:val="single" w:sz="4" w:space="0" w:color="auto"/>
+              <w:bottom w:val="single" w:sz="8" w:space="0" w:color="auto"/>
+              <w:right w:val="single" w:sz="4" w:space="0" w:color="auto"/>
+            </w:tcBorders>
+            <w:shd w:val="clear" w:color="auto" w:fill="D9D9D9" w:themeFill="background1" w:themeFillShade="D9"/>
+          </w:tcPr>
+          <w:p>
+            <w:pPr>
+              <w:spacing w:before="0" w:line="240" w:lineRule="auto"/>
+              <w:jc w:val="center"/>
+              <w:rPr>
+                <w:rFonts w:cstheme="minorHAnsi"/>
+                <w:b/>
+                <w:bCs/>
+                <w:sz w:val="12"/>
+                <w:szCs w:val="12"/>
+                <w:lang w:val="en-IE" w:eastAsia="en-IE"/>
+              </w:rPr>
+            </w:pPr>
+            <m:oMathPara>
+              <m:oMath>
+                <m:sSub>
+                  <m:sSubPr>
+                    <m:ctrlPr>
+                      <w:rPr>
+                        <w:rFonts w:ascii="Cambria Math" w:hAnsi="Cambria Math" w:cstheme="minorHAnsi"/>
+                        <w:b/>
+                        <w:bCs/>
+                        <w:i/>
+                        <w:sz w:val="12"/>
+                        <w:szCs w:val="12"/>
+                        <w:lang w:val="en-IE" w:eastAsia="en-IE"/>
+                      </w:rPr>
+                    </m:ctrlPr>
+                  </m:sSubPr>
+                  <m:e>
+                    <m:r>
+                      <m:rPr>
+                        <m:sty m:val="bi"/>
+                      </m:rPr>
+                      <w:rPr>
+                        <w:rFonts w:ascii="Cambria Math" w:hAnsi="Cambria Math" w:cstheme="minorHAnsi"/>
+                        <w:sz w:val="12"/>
+                        <w:szCs w:val="12"/>
+                        <w:lang w:val="en-IE" w:eastAsia="en-IE"/>
+                      </w:rPr>
+                      <m:t>f</m:t>
+                    </m:r>
+                  </m:e>
+                  <m:sub>
+                    <m:r>
+                      <m:rPr>
+                        <m:sty m:val="bi"/>
+                      </m:rPr>
+                      <w:rPr>
+                        <w:rFonts w:ascii="Cambria Math" w:hAnsi="Cambria Math" w:cstheme="minorHAnsi"/>
+                        <w:sz w:val="12"/>
+                        <w:szCs w:val="12"/>
+                        <w:lang w:val="en-IE" w:eastAsia="en-IE"/>
+                      </w:rPr>
+                      <m:t>b</m:t>
+                    </m:r>
+                  </m:sub>
+                </m:sSub>
+              </m:oMath>
+            </m:oMathPara>
+          </w:p>
+        </w:tc>
+        <w:tc>
+          <w:tcPr>
+            <w:tcW w:w="850" w:type="dxa"/>
+            <w:tcBorders>
+              <w:top w:val="single" w:sz="8" w:space="0" w:color="auto"/>
+              <w:left w:val="single" w:sz="4" w:space="0" w:color="auto"/>
+              <w:bottom w:val="single" w:sz="8" w:space="0" w:color="auto"/>
+              <w:right w:val="single" w:sz="4" w:space="0" w:color="auto"/>
+            </w:tcBorders>
+            <w:shd w:val="clear" w:color="auto" w:fill="D9D9D9" w:themeFill="background1" w:themeFillShade="D9"/>
+          </w:tcPr>
+          <w:p>
+            <w:pPr>
+              <w:spacing w:before="0" w:line="240" w:lineRule="auto"/>
+              <w:jc w:val="center"/>
+              <w:rPr>
+                <w:rFonts w:cstheme="minorHAnsi"/>
+                <w:b/>
+                <w:bCs/>
+                <w:sz w:val="12"/>
+                <w:szCs w:val="12"/>
+                <w:lang w:val="en-IE" w:eastAsia="en-IE"/>
+              </w:rPr>
+            </w:pPr>
+            <w:r>
+              <w:rPr>
+                <w:rFonts w:cstheme="minorHAnsi"/>
+                <w:b/>
+                <w:bCs/>
+                <w:sz w:val="12"/>
+                <w:szCs w:val="12"/>
+                <w:lang w:val="en-IE" w:eastAsia="en-IE"/>
+              </w:rPr>
+              <w:t>n</w:t>
+            </w:r>
+          </w:p>
+        </w:tc>
+        <w:tc>
+          <w:tcPr>
+            <w:tcW w:w="851" w:type="dxa"/>
+            <w:tcBorders>
+              <w:top w:val="single" w:sz="8" w:space="0" w:color="auto"/>
+              <w:left w:val="single" w:sz="4" w:space="0" w:color="auto"/>
+              <w:bottom w:val="single" w:sz="8" w:space="0" w:color="auto"/>
+              <w:right w:val="single" w:sz="4" w:space="0" w:color="auto"/>
+            </w:tcBorders>
+            <w:shd w:val="clear" w:color="auto" w:fill="D9D9D9" w:themeFill="background1" w:themeFillShade="D9"/>
+          </w:tcPr>
+          <w:p>
+            <w:pPr>
+              <w:spacing w:before="0" w:line="240" w:lineRule="auto"/>
+              <w:jc w:val="center"/>
+              <w:rPr>
+                <w:rFonts w:cstheme="minorHAnsi"/>
+                <w:b/>
+                <w:bCs/>
+                <w:sz w:val="12"/>
+                <w:szCs w:val="12"/>
+                <w:lang w:val="en-IE" w:eastAsia="en-IE"/>
+              </w:rPr>
+            </w:pPr>
+            <w:r>
+              <w:rPr>
+                <w:rFonts w:cstheme="minorHAnsi"/>
+                <w:b/>
+                <w:bCs/>
+                <w:sz w:val="12"/>
+                <w:szCs w:val="12"/>
+                <w:lang w:val="en-IE" w:eastAsia="en-IE"/>
+              </w:rPr>
+              <w:t>-</w:t>
+            </w:r>
+          </w:p>
+        </w:tc>
+        <w:tc>
+          <w:tcPr>
+            <w:tcW w:w="850" w:type="dxa"/>
+            <w:tcBorders>
+              <w:top w:val="single" w:sz="8" w:space="0" w:color="auto"/>
+              <w:left w:val="single" w:sz="4" w:space="0" w:color="auto"/>
+              <w:bottom w:val="single" w:sz="8" w:space="0" w:color="auto"/>
+              <w:right w:val="single" w:sz="4" w:space="0" w:color="auto"/>
+            </w:tcBorders>
+            <w:shd w:val="clear" w:color="auto" w:fill="D9D9D9" w:themeFill="background1" w:themeFillShade="D9"/>
+          </w:tcPr>
+          <w:p>
+            <w:pPr>
+              <w:spacing w:before="0" w:line="240" w:lineRule="auto"/>
+              <w:jc w:val="center"/>
+              <w:rPr>
+                <w:rFonts w:cstheme="minorHAnsi"/>
+                <w:b/>
+                <w:bCs/>
+                <w:sz w:val="12"/>
+                <w:szCs w:val="12"/>
+                <w:lang w:val="en-IE" w:eastAsia="en-IE"/>
+              </w:rPr>
+            </w:pPr>
+            <w:r>
+              <w:rPr>
+                <w:rFonts w:cstheme="minorHAnsi"/>
+                <w:b/>
+                <w:bCs/>
+                <w:sz w:val="12"/>
+                <w:szCs w:val="12"/>
+                <w:lang w:val="en-IE" w:eastAsia="en-IE"/>
+              </w:rPr>
+              <w:t>N</w:t>
+            </w:r>
+          </w:p>
+        </w:tc>
+        <w:tc>
+          <w:tcPr>
+            <w:tcW w:w="993" w:type="dxa"/>
+            <w:tcBorders>
+              <w:top w:val="single" w:sz="8" w:space="0" w:color="auto"/>
+              <w:left w:val="single" w:sz="4" w:space="0" w:color="auto"/>
+              <w:bottom w:val="single" w:sz="8" w:space="0" w:color="auto"/>
+              <w:right w:val="single" w:sz="8" w:space="0" w:color="auto"/>
+            </w:tcBorders>
+            <w:shd w:val="clear" w:color="auto" w:fill="D9D9D9" w:themeFill="background1" w:themeFillShade="D9"/>
+          </w:tcPr>
+          <w:p>
+            <w:pPr>
+              <w:spacing w:before="0" w:line="240" w:lineRule="auto"/>
+              <w:jc w:val="center"/>
+              <w:rPr>
+                <w:rFonts w:cstheme="minorHAnsi"/>
+                <w:b/>
+                <w:bCs/>
+                <w:sz w:val="12"/>
+                <w:szCs w:val="12"/>
+                <w:lang w:val="en-IE" w:eastAsia="en-IE"/>
+              </w:rPr>
+            </w:pPr>
+            <w:r>
+              <w:rPr>
+                <w:rFonts w:cstheme="minorHAnsi"/>
+                <w:b/>
+                <w:bCs/>
+                <w:sz w:val="12"/>
+                <w:szCs w:val="12"/>
+                <w:lang w:val="en-IE" w:eastAsia="en-IE"/>
+              </w:rPr>
+              <w:t>Vj = n/N</w:t>
             </w:r>
           </w:p>
         </w:tc>

</xml_diff>